<commit_message>
Added Total exercise for OO review
</commit_message>
<xml_diff>
--- a/Total Exercise.docx
+++ b/Total Exercise.docx
@@ -2,77 +2,6 @@
 <file path=word/document.xml><?xml version="1.0" encoding="utf-8"?>
 <w:document xmlns:wpc="http://schemas.microsoft.com/office/word/2010/wordprocessingCanvas" xmlns:cx="http://schemas.microsoft.com/office/drawing/2014/chartex" xmlns:cx1="http://schemas.microsoft.com/office/drawing/2015/9/8/chartex" xmlns:cx2="http://schemas.microsoft.com/office/drawing/2015/10/21/chartex" xmlns:cx3="http://schemas.microsoft.com/office/drawing/2016/5/9/chartex" xmlns:cx4="http://schemas.microsoft.com/office/drawing/2016/5/10/chartex" xmlns:cx5="http://schemas.microsoft.com/office/drawing/2016/5/11/chartex" xmlns:cx6="http://schemas.microsoft.com/office/drawing/2016/5/12/chartex" xmlns:cx7="http://schemas.microsoft.com/office/drawing/2016/5/13/chartex" xmlns:cx8="http://schemas.microsoft.com/office/drawing/2016/5/14/chartex" xmlns:mc="http://schemas.openxmlformats.org/markup-compatibility/2006" xmlns:aink="http://schemas.microsoft.com/office/drawing/2016/ink" xmlns:am3d="http://schemas.microsoft.com/office/drawing/2017/model3d" xmlns:o="urn:schemas-microsoft-com:office:office" xmlns:oel="http://schemas.microsoft.com/office/2019/extlst" xmlns:r="http://schemas.openxmlformats.org/officeDocument/2006/relationships" xmlns:m="http://schemas.openxmlformats.org/officeDocument/2006/math" xmlns:v="urn:schemas-microsoft-com:vml" xmlns:wp14="http://schemas.microsoft.com/office/word/2010/wordprocessingDrawing" xmlns:wp="http://schemas.openxmlformats.org/drawingml/2006/wordprocessingDrawing" xmlns:w10="urn:schemas-microsoft-com:office:word" xmlns:w="http://schemas.openxmlformats.org/wordprocessingml/2006/main" xmlns:w14="http://schemas.microsoft.com/office/word/2010/wordml" xmlns:w15="http://schemas.microsoft.com/office/word/2012/wordml" xmlns:w16cex="http://schemas.microsoft.com/office/word/2018/wordml/cex" xmlns:w16cid="http://schemas.microsoft.com/office/word/2016/wordml/cid" xmlns:w16="http://schemas.microsoft.com/office/word/2018/wordml" xmlns:w16du="http://schemas.microsoft.com/office/word/2023/wordml/word16du" xmlns:w16sdtdh="http://schemas.microsoft.com/office/word/2020/wordml/sdtdatahash" xmlns:w16sdtfl="http://schemas.microsoft.com/office/word/2024/wordml/sdtformatlock" xmlns:w16se="http://schemas.microsoft.com/office/word/2015/wordml/symex" xmlns:wpg="http://schemas.microsoft.com/office/word/2010/wordprocessingGroup" xmlns:wpi="http://schemas.microsoft.com/office/word/2010/wordprocessingInk" xmlns:wne="http://schemas.microsoft.com/office/word/2006/wordml" xmlns:wps="http://schemas.microsoft.com/office/word/2010/wordprocessingShape" mc:Ignorable="w14 w15 w16se w16cid w16 w16cex w16sdtdh w16sdtfl w16du wp14">
   <w:body>
-    <w:p/>
-    <w:p>
-      <w:r>
-        <mc:AlternateContent>
-          <mc:Choice Requires="wps">
-            <w:drawing>
-              <wp:inline distT="0" distB="0" distL="0" distR="0" wp14:anchorId="65D41C25" wp14:editId="3392E81B">
-                <wp:extent cx="304800" cy="304800"/>
-                <wp:effectExtent l="0" t="0" r="0" b="0"/>
-                <wp:docPr id="534687605" name="Rectangle 5" descr="Image"/>
-                <wp:cNvGraphicFramePr>
-                  <a:graphicFrameLocks xmlns:a="http://schemas.openxmlformats.org/drawingml/2006/main" noChangeAspect="1"/>
-                </wp:cNvGraphicFramePr>
-                <a:graphic xmlns:a="http://schemas.openxmlformats.org/drawingml/2006/main">
-                  <a:graphicData uri="http://schemas.microsoft.com/office/word/2010/wordprocessingShape">
-                    <wps:wsp>
-                      <wps:cNvSpPr>
-                        <a:spLocks noChangeAspect="1" noChangeArrowheads="1"/>
-                      </wps:cNvSpPr>
-                      <wps:spPr bwMode="auto">
-                        <a:xfrm>
-                          <a:off x="0" y="0"/>
-                          <a:ext cx="304800" cy="304800"/>
-                        </a:xfrm>
-                        <a:prstGeom prst="rect">
-                          <a:avLst/>
-                        </a:prstGeom>
-                        <a:noFill/>
-                        <a:ln>
-                          <a:noFill/>
-                        </a:ln>
-                        <a:extLst>
-                          <a:ext uri="{909E8E84-426E-40DD-AFC4-6F175D3DCCD1}">
-                            <a14:hiddenFill xmlns:a14="http://schemas.microsoft.com/office/drawing/2010/main">
-                              <a:solidFill>
-                                <a:srgbClr val="FFFFFF"/>
-                              </a:solidFill>
-                            </a14:hiddenFill>
-                          </a:ext>
-                          <a:ext uri="{91240B29-F687-4F45-9708-019B960494DF}">
-                            <a14:hiddenLine xmlns:a14="http://schemas.microsoft.com/office/drawing/2010/main" w="9525">
-                              <a:solidFill>
-                                <a:srgbClr val="000000"/>
-                              </a:solidFill>
-                              <a:miter lim="800000"/>
-                              <a:headEnd/>
-                              <a:tailEnd/>
-                            </a14:hiddenLine>
-                          </a:ext>
-                        </a:extLst>
-                      </wps:spPr>
-                      <wps:bodyPr rot="0" vert="horz" wrap="square" lIns="91440" tIns="45720" rIns="91440" bIns="45720" anchor="t" anchorCtr="0" upright="1">
-                        <a:noAutofit/>
-                      </wps:bodyPr>
-                    </wps:wsp>
-                  </a:graphicData>
-                </a:graphic>
-              </wp:inline>
-            </w:drawing>
-          </mc:Choice>
-          <mc:Fallback>
-            <w:pict>
-              <v:rect w14:anchorId="36C0A803" id="Rectangle 5" o:spid="_x0000_s1026" alt="Image" style="width:24pt;height:24pt;visibility:visible;mso-wrap-style:square;mso-left-percent:-10001;mso-top-percent:-10001;mso-position-horizontal:absolute;mso-position-horizontal-relative:char;mso-position-vertical:absolute;mso-position-vertical-relative:line;mso-left-percent:-10001;mso-top-percent:-10001;v-text-anchor:top" o:gfxdata="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" filled="f" stroked="f">
-                <o:lock v:ext="edit" aspectratio="t"/>
-                <w10:anchorlock/>
-              </v:rect>
-            </w:pict>
-          </mc:Fallback>
-        </mc:AlternateContent>
-      </w:r>
-    </w:p>
     <w:p>
       <w:pPr>
         <w:pStyle w:val="Heading1"/>
@@ -440,7 +369,6 @@
           <w:b/>
           <w:bCs/>
         </w:rPr>
-        <w:lastRenderedPageBreak/>
         <w:t>Requirements</w:t>
       </w:r>
     </w:p>
@@ -515,6 +443,7 @@
         <w:pStyle w:val="Heading3"/>
       </w:pPr>
       <w:r>
+        <w:lastRenderedPageBreak/>
         <w:t xml:space="preserve">4 </w:t>
       </w:r>
       <w:proofErr w:type="spellStart"/>
@@ -981,7 +910,6 @@
     </w:p>
     <w:p>
       <w:r>
-        <w:lastRenderedPageBreak/>
         <w:tab/>
       </w:r>
       <w:r>
@@ -1035,6 +963,7 @@
         <w:pStyle w:val="Heading2"/>
       </w:pPr>
       <w:r>
+        <w:lastRenderedPageBreak/>
         <w:t xml:space="preserve">Part 5 </w:t>
       </w:r>
       <w:r>
@@ -12178,6 +12107,7 @@
   <w:style w:type="character" w:default="1" w:styleId="DefaultParagraphFont">
     <w:name w:val="Default Paragraph Font"/>
     <w:uiPriority w:val="1"/>
+    <w:semiHidden/>
     <w:unhideWhenUsed/>
   </w:style>
   <w:style w:type="table" w:default="1" w:styleId="TableNormal">

</xml_diff>